<commit_message>
step(1.3): add Documents module skeleton with its own DbContext and schema
Learned: ABP module dependency graph, DbContext-per-module with separate migrations history, context-scoped provider config, design-time factory, conventional registration vs ExposeServices, module tables in the Sqlite test DB
</commit_message>
<xml_diff>
--- a/docs/deliverables/out/Database.docx
+++ b/docs/deliverables/out/Database.docx
@@ -177,6 +177,67 @@
           </w:p>
         </w:tc>
       </w:tr>
+      <w:tr>
+        <w:tc>
+          <w:tcPr/>
+          <w:p>
+            <w:pPr>
+              <w:pStyle w:val="Compact"/>
+            </w:pPr>
+            <w:r>
+              <w:t xml:space="preserve">0.1.1</w:t>
+            </w:r>
+          </w:p>
+        </w:tc>
+        <w:tc>
+          <w:tcPr/>
+          <w:p>
+            <w:pPr>
+              <w:pStyle w:val="Compact"/>
+            </w:pPr>
+            <w:r>
+              <w:t xml:space="preserve">2026-08-27</w:t>
+            </w:r>
+          </w:p>
+        </w:tc>
+        <w:tc>
+          <w:tcPr/>
+          <w:p>
+            <w:pPr>
+              <w:pStyle w:val="Compact"/>
+            </w:pPr>
+            <w:r>
+              <w:t xml:space="preserve">Abdulsalam</w:t>
+            </w:r>
+          </w:p>
+        </w:tc>
+        <w:tc>
+          <w:tcPr/>
+          <w:p>
+            <w:pPr>
+              <w:pStyle w:val="Compact"/>
+            </w:pPr>
+            <w:r>
+              <w:t xml:space="preserve">Migrations log: host initial migration (1.1),</w:t>
+            </w:r>
+            <w:r>
+              <w:t xml:space="preserve"> </w:t>
+            </w:r>
+            <w:r>
+              <w:rPr>
+                <w:rStyle w:val="VerbatimChar"/>
+              </w:rPr>
+              <w:t xml:space="preserve">documents</w:t>
+            </w:r>
+            <w:r>
+              <w:t xml:space="preserve"> </w:t>
+            </w:r>
+            <w:r>
+              <w:t xml:space="preserve">schema initial migration (1.3)</w:t>
+            </w:r>
+          </w:p>
+        </w:tc>
+      </w:tr>
     </w:tbl>
     <w:p>
       <w:pPr>
@@ -233,7 +294,7 @@
         <w:t xml:space="preserve"> </w:t>
       </w:r>
       <w:r>
-        <w:t xml:space="preserve">Everything in this version is</w:t>
+        <w:t xml:space="preserve">Tables in this version are</w:t>
       </w:r>
       <w:r>
         <w:t xml:space="preserve"> </w:t>
@@ -246,13 +307,16 @@
         <w:t xml:space="preserve">Planned</w:t>
       </w:r>
       <w:r>
-        <w:t xml:space="preserve">: no migration exists yet. The migrations log (§ 6) is</w:t>
-      </w:r>
-      <w:r>
         <w:t xml:space="preserve"> </w:t>
       </w:r>
       <w:r>
-        <w:t xml:space="preserve">appended in the same commit as each migration from Phase 1 on.</w:t>
+        <w:t xml:space="preserve">until their migration appears in the migrations log, which</w:t>
+      </w:r>
+      <w:r>
+        <w:t xml:space="preserve"> </w:t>
+      </w:r>
+      <w:r>
+        <w:t xml:space="preserve">is appended in the same commit as each migration.</w:t>
       </w:r>
     </w:p>
     <w:bookmarkEnd w:id="9"/>
@@ -9306,7 +9370,8 @@
     <w:tbl>
       <w:tblPr>
         <w:tblStyle w:val="Table"/>
-        <w:tblW w:type="auto" w:w="0"/>
+        <w:tblW w:type="pct" w:w="5000"/>
+        <w:tblLayout w:type="fixed"/>
         <w:tblLook w:firstRow="1" w:lastRow="0" w:firstColumn="0" w:lastColumn="0" w:noHBand="0" w:noVBand="0" w:val="0020"/>
       </w:tblPr>
       <w:tblGrid>
@@ -9384,55 +9449,165 @@
               <w:pStyle w:val="Compact"/>
             </w:pPr>
             <w:r>
-              <w:t xml:space="preserve">—</w:t>
-            </w:r>
-          </w:p>
-        </w:tc>
-        <w:tc>
-          <w:tcPr/>
-          <w:p>
-            <w:pPr>
-              <w:pStyle w:val="Compact"/>
-            </w:pPr>
-            <w:r>
-              <w:t xml:space="preserve">—</w:t>
-            </w:r>
-          </w:p>
-        </w:tc>
-        <w:tc>
-          <w:tcPr/>
-          <w:p>
-            <w:pPr>
-              <w:pStyle w:val="Compact"/>
-            </w:pPr>
-            <w:r>
-              <w:t xml:space="preserve">—</w:t>
-            </w:r>
-          </w:p>
-        </w:tc>
-        <w:tc>
-          <w:tcPr/>
-          <w:p>
-            <w:pPr>
-              <w:pStyle w:val="Compact"/>
-            </w:pPr>
+              <w:t xml:space="preserve">1</w:t>
+            </w:r>
+          </w:p>
+        </w:tc>
+        <w:tc>
+          <w:tcPr/>
+          <w:p>
+            <w:pPr>
+              <w:pStyle w:val="Compact"/>
+            </w:pPr>
+            <w:r>
+              <w:t xml:space="preserve">2026-08-27</w:t>
+            </w:r>
+          </w:p>
+        </w:tc>
+        <w:tc>
+          <w:tcPr/>
+          <w:p>
+            <w:pPr>
+              <w:pStyle w:val="Compact"/>
+            </w:pPr>
+            <w:r>
+              <w:t xml:space="preserve">host (</w:t>
+            </w:r>
             <w:r>
               <w:rPr>
-                <w:i/>
-                <w:iCs/>
+                <w:rStyle w:val="VerbatimChar"/>
               </w:rPr>
-              <w:t xml:space="preserve">None yet — first migration lands in Phase 1</w:t>
-            </w:r>
-          </w:p>
-        </w:tc>
-        <w:tc>
-          <w:tcPr/>
-          <w:p>
-            <w:pPr>
-              <w:pStyle w:val="Compact"/>
-            </w:pPr>
-            <w:r>
-              <w:t xml:space="preserve">1.x</w:t>
+              <w:t xml:space="preserve">WathiqDbContext</w:t>
+            </w:r>
+            <w:r>
+              <w:t xml:space="preserve">, dbo)</w:t>
+            </w:r>
+          </w:p>
+        </w:tc>
+        <w:tc>
+          <w:tcPr/>
+          <w:p>
+            <w:pPr>
+              <w:pStyle w:val="Compact"/>
+            </w:pPr>
+            <w:r>
+              <w:rPr>
+                <w:rStyle w:val="VerbatimChar"/>
+              </w:rPr>
+              <w:t xml:space="preserve">20260827120335_InitialMigration</w:t>
+            </w:r>
+            <w:r>
+              <w:t xml:space="preserve"> </w:t>
+            </w:r>
+            <w:r>
+              <w:t xml:space="preserve">— ABP Identity, OpenIddict, permissions, settings, audit, background jobs, blobs</w:t>
+            </w:r>
+          </w:p>
+        </w:tc>
+        <w:tc>
+          <w:tcPr/>
+          <w:p>
+            <w:pPr>
+              <w:pStyle w:val="Compact"/>
+            </w:pPr>
+            <w:r>
+              <w:t xml:space="preserve">1.1</w:t>
+            </w:r>
+          </w:p>
+        </w:tc>
+      </w:tr>
+      <w:tr>
+        <w:tc>
+          <w:tcPr/>
+          <w:p>
+            <w:pPr>
+              <w:pStyle w:val="Compact"/>
+            </w:pPr>
+            <w:r>
+              <w:t xml:space="preserve">2</w:t>
+            </w:r>
+          </w:p>
+        </w:tc>
+        <w:tc>
+          <w:tcPr/>
+          <w:p>
+            <w:pPr>
+              <w:pStyle w:val="Compact"/>
+            </w:pPr>
+            <w:r>
+              <w:t xml:space="preserve">2026-08-27</w:t>
+            </w:r>
+          </w:p>
+        </w:tc>
+        <w:tc>
+          <w:tcPr/>
+          <w:p>
+            <w:pPr>
+              <w:pStyle w:val="Compact"/>
+            </w:pPr>
+            <w:r>
+              <w:t xml:space="preserve">Documents (</w:t>
+            </w:r>
+            <w:r>
+              <w:rPr>
+                <w:rStyle w:val="VerbatimChar"/>
+              </w:rPr>
+              <w:t xml:space="preserve">DocumentsDbContext</w:t>
+            </w:r>
+            <w:r>
+              <w:t xml:space="preserve">, schema</w:t>
+            </w:r>
+            <w:r>
+              <w:t xml:space="preserve"> </w:t>
+            </w:r>
+            <w:r>
+              <w:rPr>
+                <w:rStyle w:val="VerbatimChar"/>
+              </w:rPr>
+              <w:t xml:space="preserve">documents</w:t>
+            </w:r>
+            <w:r>
+              <w:t xml:space="preserve">)</w:t>
+            </w:r>
+          </w:p>
+        </w:tc>
+        <w:tc>
+          <w:tcPr/>
+          <w:p>
+            <w:pPr>
+              <w:pStyle w:val="Compact"/>
+            </w:pPr>
+            <w:r>
+              <w:rPr>
+                <w:rStyle w:val="VerbatimChar"/>
+              </w:rPr>
+              <w:t xml:space="preserve">20260827131340_Initial</w:t>
+            </w:r>
+            <w:r>
+              <w:t xml:space="preserve"> </w:t>
+            </w:r>
+            <w:r>
+              <w:t xml:space="preserve">— empty; creates the schema and</w:t>
+            </w:r>
+            <w:r>
+              <w:t xml:space="preserve"> </w:t>
+            </w:r>
+            <w:r>
+              <w:rPr>
+                <w:rStyle w:val="VerbatimChar"/>
+              </w:rPr>
+              <w:t xml:space="preserve">documents.__EFMigrationsHistory</w:t>
+            </w:r>
+          </w:p>
+        </w:tc>
+        <w:tc>
+          <w:tcPr/>
+          <w:p>
+            <w:pPr>
+              <w:pStyle w:val="Compact"/>
+            </w:pPr>
+            <w:r>
+              <w:t xml:space="preserve">1.3</w:t>
             </w:r>
           </w:p>
         </w:tc>

</xml_diff>

<commit_message>
step(1.4): add DocumentType and Holder aggregates with seed and migration
Learned: FullAuditedAggregateRoot, guarded constructors and private setters, IEntityTypeConfiguration with ConfigureByConvention, filtered unique index, IDataSeedContributor idempotency, DomainService, per-context AbpDbContextOptions precedence
</commit_message>
<xml_diff>
--- a/docs/deliverables/out/Database.docx
+++ b/docs/deliverables/out/Database.docx
@@ -234,6 +234,92 @@
             </w:r>
             <w:r>
               <w:t xml:space="preserve">schema initial migration (1.3)</w:t>
+            </w:r>
+          </w:p>
+        </w:tc>
+      </w:tr>
+      <w:tr>
+        <w:tc>
+          <w:tcPr/>
+          <w:p>
+            <w:pPr>
+              <w:pStyle w:val="Compact"/>
+            </w:pPr>
+            <w:r>
+              <w:t xml:space="preserve">0.1.2</w:t>
+            </w:r>
+          </w:p>
+        </w:tc>
+        <w:tc>
+          <w:tcPr/>
+          <w:p>
+            <w:pPr>
+              <w:pStyle w:val="Compact"/>
+            </w:pPr>
+            <w:r>
+              <w:t xml:space="preserve">2026-08-27</w:t>
+            </w:r>
+          </w:p>
+        </w:tc>
+        <w:tc>
+          <w:tcPr/>
+          <w:p>
+            <w:pPr>
+              <w:pStyle w:val="Compact"/>
+            </w:pPr>
+            <w:r>
+              <w:t xml:space="preserve">Abdulsalam</w:t>
+            </w:r>
+          </w:p>
+        </w:tc>
+        <w:tc>
+          <w:tcPr/>
+          <w:p>
+            <w:pPr>
+              <w:pStyle w:val="Compact"/>
+            </w:pPr>
+            <w:r>
+              <w:t xml:space="preserve">Migrations log row 3:</w:t>
+            </w:r>
+            <w:r>
+              <w:t xml:space="preserve"> </w:t>
+            </w:r>
+            <w:r>
+              <w:rPr>
+                <w:rStyle w:val="VerbatimChar"/>
+              </w:rPr>
+              <w:t xml:space="preserve">DocumentType</w:t>
+            </w:r>
+            <w:r>
+              <w:t xml:space="preserve"> </w:t>
+            </w:r>
+            <w:r>
+              <w:t xml:space="preserve">+</w:t>
+            </w:r>
+            <w:r>
+              <w:t xml:space="preserve"> </w:t>
+            </w:r>
+            <w:r>
+              <w:rPr>
+                <w:rStyle w:val="VerbatimChar"/>
+              </w:rPr>
+              <w:t xml:space="preserve">Holder</w:t>
+            </w:r>
+            <w:r>
+              <w:t xml:space="preserve"> </w:t>
+            </w:r>
+            <w:r>
+              <w:t xml:space="preserve">tables and indexes (1.4); those two tables are now</w:t>
+            </w:r>
+            <w:r>
+              <w:t xml:space="preserve"> </w:t>
+            </w:r>
+            <w:r>
+              <w:rPr>
+                <w:i/>
+                <w:iCs/>
+              </w:rPr>
+              <w:t xml:space="preserve">Implemented</w:t>
             </w:r>
           </w:p>
         </w:tc>
@@ -1418,7 +1504,7 @@
         <w:t xml:space="preserve">documents</w:t>
       </w:r>
     </w:p>
-    <w:bookmarkStart w:id="16" w:name="documents.documenttype-e-documenttype"/>
+    <w:bookmarkStart w:id="16" w:name="Xa8fa8534f55e559621e8db85df33a5040b1c2ba"/>
     <w:p>
       <w:pPr>
         <w:pStyle w:val="Heading3"/>
@@ -1442,7 +1528,17 @@
         <w:t xml:space="preserve"> </w:t>
       </w:r>
       <w:r>
-        <w:t xml:space="preserve">(E-DocumentType)</w:t>
+        <w:t xml:space="preserve">(E-DocumentType) —</w:t>
+      </w:r>
+      <w:r>
+        <w:t xml:space="preserve"> </w:t>
+      </w:r>
+      <w:r>
+        <w:rPr>
+          <w:i/>
+          <w:iCs/>
+        </w:rPr>
+        <w:t xml:space="preserve">Implemented (1.4)</w:t>
       </w:r>
     </w:p>
     <w:tbl>
@@ -1970,7 +2066,7 @@
       </w:tr>
     </w:tbl>
     <w:bookmarkEnd w:id="16"/>
-    <w:bookmarkStart w:id="17" w:name="documents.holder-e-holder"/>
+    <w:bookmarkStart w:id="17" w:name="X90f66a90d4a55ae139b27814113e109297b3965"/>
     <w:p>
       <w:pPr>
         <w:pStyle w:val="Heading3"/>
@@ -1994,7 +2090,17 @@
         <w:t xml:space="preserve"> </w:t>
       </w:r>
       <w:r>
-        <w:t xml:space="preserve">(E-Holder)</w:t>
+        <w:t xml:space="preserve">(E-Holder) —</w:t>
+      </w:r>
+      <w:r>
+        <w:t xml:space="preserve"> </w:t>
+      </w:r>
+      <w:r>
+        <w:rPr>
+          <w:i/>
+          <w:iCs/>
+        </w:rPr>
+        <w:t xml:space="preserve">Implemented (1.4)</w:t>
       </w:r>
     </w:p>
     <w:tbl>
@@ -9608,6 +9714,132 @@
             </w:pPr>
             <w:r>
               <w:t xml:space="preserve">1.3</w:t>
+            </w:r>
+          </w:p>
+        </w:tc>
+      </w:tr>
+      <w:tr>
+        <w:tc>
+          <w:tcPr/>
+          <w:p>
+            <w:pPr>
+              <w:pStyle w:val="Compact"/>
+            </w:pPr>
+            <w:r>
+              <w:t xml:space="preserve">3</w:t>
+            </w:r>
+          </w:p>
+        </w:tc>
+        <w:tc>
+          <w:tcPr/>
+          <w:p>
+            <w:pPr>
+              <w:pStyle w:val="Compact"/>
+            </w:pPr>
+            <w:r>
+              <w:t xml:space="preserve">2026-08-27</w:t>
+            </w:r>
+          </w:p>
+        </w:tc>
+        <w:tc>
+          <w:tcPr/>
+          <w:p>
+            <w:pPr>
+              <w:pStyle w:val="Compact"/>
+            </w:pPr>
+            <w:r>
+              <w:t xml:space="preserve">Documents</w:t>
+            </w:r>
+          </w:p>
+        </w:tc>
+        <w:tc>
+          <w:tcPr/>
+          <w:p>
+            <w:pPr>
+              <w:pStyle w:val="Compact"/>
+            </w:pPr>
+            <w:r>
+              <w:rPr>
+                <w:rStyle w:val="VerbatimChar"/>
+              </w:rPr>
+              <w:t xml:space="preserve">20260827131957_AddDocumentTypeAndHolder</w:t>
+            </w:r>
+            <w:r>
+              <w:t xml:space="preserve"> </w:t>
+            </w:r>
+            <w:r>
+              <w:t xml:space="preserve">— tables</w:t>
+            </w:r>
+            <w:r>
+              <w:t xml:space="preserve"> </w:t>
+            </w:r>
+            <w:r>
+              <w:rPr>
+                <w:rStyle w:val="VerbatimChar"/>
+              </w:rPr>
+              <w:t xml:space="preserve">DocumentType</w:t>
+            </w:r>
+            <w:r>
+              <w:t xml:space="preserve">,</w:t>
+            </w:r>
+            <w:r>
+              <w:t xml:space="preserve"> </w:t>
+            </w:r>
+            <w:r>
+              <w:rPr>
+                <w:rStyle w:val="VerbatimChar"/>
+              </w:rPr>
+              <w:t xml:space="preserve">Holder</w:t>
+            </w:r>
+            <w:r>
+              <w:t xml:space="preserve">;</w:t>
+            </w:r>
+            <w:r>
+              <w:t xml:space="preserve"> </w:t>
+            </w:r>
+            <w:r>
+              <w:rPr>
+                <w:rStyle w:val="VerbatimChar"/>
+              </w:rPr>
+              <w:t xml:space="preserve">UQ_DocumentType_Code</w:t>
+            </w:r>
+            <w:r>
+              <w:t xml:space="preserve">;</w:t>
+            </w:r>
+            <w:r>
+              <w:t xml:space="preserve"> </w:t>
+            </w:r>
+            <w:r>
+              <w:rPr>
+                <w:rStyle w:val="VerbatimChar"/>
+              </w:rPr>
+              <w:t xml:space="preserve">IX_Holder_UserId</w:t>
+            </w:r>
+            <w:r>
+              <w:t xml:space="preserve">; filtered</w:t>
+            </w:r>
+            <w:r>
+              <w:t xml:space="preserve"> </w:t>
+            </w:r>
+            <w:r>
+              <w:rPr>
+                <w:rStyle w:val="VerbatimChar"/>
+              </w:rPr>
+              <w:t xml:space="preserve">UQ_Holder_UserId_IsSelf</w:t>
+            </w:r>
+            <w:r>
+              <w:t xml:space="preserve">; catalogue seeded (8 types)</w:t>
+            </w:r>
+          </w:p>
+        </w:tc>
+        <w:tc>
+          <w:tcPr/>
+          <w:p>
+            <w:pPr>
+              <w:pStyle w:val="Compact"/>
+            </w:pPr>
+            <w:r>
+              <w:t xml:space="preserve">1.4</w:t>
             </w:r>
           </w:p>
         </w:tc>

</xml_diff>

<commit_message>
step(1.5): add Document aggregate with ValidityPeriod value object and Attachment
Learned: value objects vs primitive obsession, ABP ValueObject equality, EF Core owned types, aggregate-internal collections without a child repository, intra-schema FK delete behaviours, module-owned localization for BusinessException codes
</commit_message>
<xml_diff>
--- a/docs/deliverables/out/Database.docx
+++ b/docs/deliverables/out/Database.docx
@@ -320,6 +320,115 @@
                 <w:iCs/>
               </w:rPr>
               <w:t xml:space="preserve">Implemented</w:t>
+            </w:r>
+          </w:p>
+        </w:tc>
+      </w:tr>
+      <w:tr>
+        <w:tc>
+          <w:tcPr/>
+          <w:p>
+            <w:pPr>
+              <w:pStyle w:val="Compact"/>
+            </w:pPr>
+            <w:r>
+              <w:t xml:space="preserve">0.1.3</w:t>
+            </w:r>
+          </w:p>
+        </w:tc>
+        <w:tc>
+          <w:tcPr/>
+          <w:p>
+            <w:pPr>
+              <w:pStyle w:val="Compact"/>
+            </w:pPr>
+            <w:r>
+              <w:t xml:space="preserve">2026-08-27</w:t>
+            </w:r>
+          </w:p>
+        </w:tc>
+        <w:tc>
+          <w:tcPr/>
+          <w:p>
+            <w:pPr>
+              <w:pStyle w:val="Compact"/>
+            </w:pPr>
+            <w:r>
+              <w:t xml:space="preserve">Abdulsalam</w:t>
+            </w:r>
+          </w:p>
+        </w:tc>
+        <w:tc>
+          <w:tcPr/>
+          <w:p>
+            <w:pPr>
+              <w:pStyle w:val="Compact"/>
+            </w:pPr>
+            <w:r>
+              <w:t xml:space="preserve">Migrations log row 4:</w:t>
+            </w:r>
+            <w:r>
+              <w:t xml:space="preserve"> </w:t>
+            </w:r>
+            <w:r>
+              <w:rPr>
+                <w:rStyle w:val="VerbatimChar"/>
+              </w:rPr>
+              <w:t xml:space="preserve">Document</w:t>
+            </w:r>
+            <w:r>
+              <w:t xml:space="preserve"> </w:t>
+            </w:r>
+            <w:r>
+              <w:t xml:space="preserve">+</w:t>
+            </w:r>
+            <w:r>
+              <w:t xml:space="preserve"> </w:t>
+            </w:r>
+            <w:r>
+              <w:rPr>
+                <w:rStyle w:val="VerbatimChar"/>
+              </w:rPr>
+              <w:t xml:space="preserve">Attachment</w:t>
+            </w:r>
+            <w:r>
+              <w:t xml:space="preserve"> </w:t>
+            </w:r>
+            <w:r>
+              <w:t xml:space="preserve">(1.5);</w:t>
+            </w:r>
+            <w:r>
+              <w:t xml:space="preserve"> </w:t>
+            </w:r>
+            <w:r>
+              <w:rPr>
+                <w:rStyle w:val="VerbatimChar"/>
+              </w:rPr>
+              <w:t xml:space="preserve">IssueDate</w:t>
+            </w:r>
+            <w:r>
+              <w:t xml:space="preserve">/</w:t>
+            </w:r>
+            <w:r>
+              <w:rPr>
+                <w:rStyle w:val="VerbatimChar"/>
+              </w:rPr>
+              <w:t xml:space="preserve">ExpiryDate</w:t>
+            </w:r>
+            <w:r>
+              <w:t xml:space="preserve"> </w:t>
+            </w:r>
+            <w:r>
+              <w:t xml:space="preserve">documented as the owned value object</w:t>
+            </w:r>
+            <w:r>
+              <w:t xml:space="preserve"> </w:t>
+            </w:r>
+            <w:r>
+              <w:rPr>
+                <w:rStyle w:val="VerbatimChar"/>
+              </w:rPr>
+              <w:t xml:space="preserve">ValidityPeriod</w:t>
             </w:r>
           </w:p>
         </w:tc>
@@ -2455,7 +2564,7 @@
       </w:tr>
     </w:tbl>
     <w:bookmarkEnd w:id="17"/>
-    <w:bookmarkStart w:id="18" w:name="documents.document-e-document"/>
+    <w:bookmarkStart w:id="18" w:name="X3ae7046e6de1bcb4226db6c3362c9e1a41f4bcc"/>
     <w:p>
       <w:pPr>
         <w:pStyle w:val="Heading3"/>
@@ -2479,7 +2588,17 @@
         <w:t xml:space="preserve"> </w:t>
       </w:r>
       <w:r>
-        <w:t xml:space="preserve">(E-Document)</w:t>
+        <w:t xml:space="preserve">(E-Document) —</w:t>
+      </w:r>
+      <w:r>
+        <w:t xml:space="preserve"> </w:t>
+      </w:r>
+      <w:r>
+        <w:rPr>
+          <w:i/>
+          <w:iCs/>
+        </w:rPr>
+        <w:t xml:space="preserve">Implemented (1.5)</w:t>
       </w:r>
     </w:p>
     <w:tbl>
@@ -2814,6 +2933,36 @@
             <w:pPr>
               <w:pStyle w:val="Compact"/>
             </w:pPr>
+            <w:r>
+              <w:t xml:space="preserve">Owned value object</w:t>
+            </w:r>
+            <w:r>
+              <w:t xml:space="preserve"> </w:t>
+            </w:r>
+            <w:r>
+              <w:rPr>
+                <w:rStyle w:val="VerbatimChar"/>
+              </w:rPr>
+              <w:t xml:space="preserve">ValidityPeriod</w:t>
+            </w:r>
+            <w:r>
+              <w:t xml:space="preserve"> </w:t>
+            </w:r>
+            <w:r>
+              <w:t xml:space="preserve">(EF</w:t>
+            </w:r>
+            <w:r>
+              <w:t xml:space="preserve"> </w:t>
+            </w:r>
+            <w:r>
+              <w:rPr>
+                <w:rStyle w:val="VerbatimChar"/>
+              </w:rPr>
+              <w:t xml:space="preserve">OwnsOne</w:t>
+            </w:r>
+            <w:r>
+              <w:t xml:space="preserve">) flattens to these two columns</w:t>
+            </w:r>
           </w:p>
         </w:tc>
       </w:tr>
@@ -2858,7 +3007,7 @@
               <w:pStyle w:val="Compact"/>
             </w:pPr>
             <w:r>
-              <w:t xml:space="preserve">Value object in domain;</w:t>
+              <w:t xml:space="preserve">Same value object;</w:t>
             </w:r>
             <w:r>
               <w:t xml:space="preserve"> </w:t>
@@ -2873,7 +3022,16 @@
               <w:t xml:space="preserve"> </w:t>
             </w:r>
             <w:r>
-              <w:t xml:space="preserve">enforced in code (FR-DOC-003)</w:t>
+              <w:t xml:space="preserve">enforced in its constructor (FR-DOC-003);</w:t>
+            </w:r>
+            <w:r>
+              <w:t xml:space="preserve"> </w:t>
+            </w:r>
+            <w:r>
+              <w:rPr>
+                <w:rStyle w:val="VerbatimChar"/>
+              </w:rPr>
+              <w:t xml:space="preserve">IX_Document_ExpiryDate</w:t>
             </w:r>
           </w:p>
         </w:tc>
@@ -3077,13 +3235,40 @@
         <w:rPr>
           <w:rStyle w:val="VerbatimChar"/>
         </w:rPr>
-        <w:t xml:space="preserve">IX_Document_OwnerUserId_ExpiryDate</w:t>
+        <w:t xml:space="preserve">IX_Document_OwnerUserId</w:t>
+      </w:r>
+      <w:r>
+        <w:t xml:space="preserve">,</w:t>
       </w:r>
       <w:r>
         <w:t xml:space="preserve"> </w:t>
       </w:r>
       <w:r>
-        <w:t xml:space="preserve">(timeline query, NFR-PRF-001),</w:t>
+        <w:rPr>
+          <w:rStyle w:val="VerbatimChar"/>
+        </w:rPr>
+        <w:t xml:space="preserve">IX_Document_ExpiryDate</w:t>
+      </w:r>
+      <w:r>
+        <w:t xml:space="preserve"> </w:t>
+      </w:r>
+      <w:r>
+        <w:t xml:space="preserve">(timeline query, NFR-PRF-001 — a composite</w:t>
+      </w:r>
+      <w:r>
+        <w:t xml:space="preserve"> </w:t>
+      </w:r>
+      <w:r>
+        <w:rPr>
+          <w:rStyle w:val="VerbatimChar"/>
+        </w:rPr>
+        <w:t xml:space="preserve">OwnerUserId, ExpiryDate</w:t>
+      </w:r>
+      <w:r>
+        <w:t xml:space="preserve"> </w:t>
+      </w:r>
+      <w:r>
+        <w:t xml:space="preserve">index is deferred until the timeline query exists in step 1.6),</w:t>
       </w:r>
       <w:r>
         <w:t xml:space="preserve"> </w:t>
@@ -3099,7 +3284,7 @@
       </w:r>
     </w:p>
     <w:bookmarkEnd w:id="18"/>
-    <w:bookmarkStart w:id="19" w:name="documents.attachment-e-attachment"/>
+    <w:bookmarkStart w:id="19" w:name="X0762fbec1b2db58192140827645cfe1f563755c"/>
     <w:p>
       <w:pPr>
         <w:pStyle w:val="Heading3"/>
@@ -3123,7 +3308,17 @@
         <w:t xml:space="preserve"> </w:t>
       </w:r>
       <w:r>
-        <w:t xml:space="preserve">(E-Attachment)</w:t>
+        <w:t xml:space="preserve">(E-Attachment) —</w:t>
+      </w:r>
+      <w:r>
+        <w:t xml:space="preserve"> </w:t>
+      </w:r>
+      <w:r>
+        <w:rPr>
+          <w:i/>
+          <w:iCs/>
+        </w:rPr>
+        <w:t xml:space="preserve">Implemented (1.5)</w:t>
       </w:r>
     </w:p>
     <w:tbl>
@@ -9840,6 +10035,147 @@
             </w:pPr>
             <w:r>
               <w:t xml:space="preserve">1.4</w:t>
+            </w:r>
+          </w:p>
+        </w:tc>
+      </w:tr>
+      <w:tr>
+        <w:tc>
+          <w:tcPr/>
+          <w:p>
+            <w:pPr>
+              <w:pStyle w:val="Compact"/>
+            </w:pPr>
+            <w:r>
+              <w:t xml:space="preserve">4</w:t>
+            </w:r>
+          </w:p>
+        </w:tc>
+        <w:tc>
+          <w:tcPr/>
+          <w:p>
+            <w:pPr>
+              <w:pStyle w:val="Compact"/>
+            </w:pPr>
+            <w:r>
+              <w:t xml:space="preserve">2026-08-27</w:t>
+            </w:r>
+          </w:p>
+        </w:tc>
+        <w:tc>
+          <w:tcPr/>
+          <w:p>
+            <w:pPr>
+              <w:pStyle w:val="Compact"/>
+            </w:pPr>
+            <w:r>
+              <w:t xml:space="preserve">Documents</w:t>
+            </w:r>
+          </w:p>
+        </w:tc>
+        <w:tc>
+          <w:tcPr/>
+          <w:p>
+            <w:pPr>
+              <w:pStyle w:val="Compact"/>
+            </w:pPr>
+            <w:r>
+              <w:rPr>
+                <w:rStyle w:val="VerbatimChar"/>
+              </w:rPr>
+              <w:t xml:space="preserve">20260827133140_AddDocumentAndAttachment</w:t>
+            </w:r>
+            <w:r>
+              <w:t xml:space="preserve"> </w:t>
+            </w:r>
+            <w:r>
+              <w:t xml:space="preserve">— tables</w:t>
+            </w:r>
+            <w:r>
+              <w:t xml:space="preserve"> </w:t>
+            </w:r>
+            <w:r>
+              <w:rPr>
+                <w:rStyle w:val="VerbatimChar"/>
+              </w:rPr>
+              <w:t xml:space="preserve">Document</w:t>
+            </w:r>
+            <w:r>
+              <w:t xml:space="preserve"> </w:t>
+            </w:r>
+            <w:r>
+              <w:t xml:space="preserve">(FKs to Holder/DocumentType, Restrict),</w:t>
+            </w:r>
+            <w:r>
+              <w:t xml:space="preserve"> </w:t>
+            </w:r>
+            <w:r>
+              <w:rPr>
+                <w:rStyle w:val="VerbatimChar"/>
+              </w:rPr>
+              <w:t xml:space="preserve">Attachment</w:t>
+            </w:r>
+            <w:r>
+              <w:t xml:space="preserve"> </w:t>
+            </w:r>
+            <w:r>
+              <w:t xml:space="preserve">(FK to Document, Cascade);</w:t>
+            </w:r>
+            <w:r>
+              <w:t xml:space="preserve"> </w:t>
+            </w:r>
+            <w:r>
+              <w:rPr>
+                <w:rStyle w:val="VerbatimChar"/>
+              </w:rPr>
+              <w:t xml:space="preserve">IX_Document_OwnerUserId</w:t>
+            </w:r>
+            <w:r>
+              <w:t xml:space="preserve">,</w:t>
+            </w:r>
+            <w:r>
+              <w:t xml:space="preserve"> </w:t>
+            </w:r>
+            <w:r>
+              <w:rPr>
+                <w:rStyle w:val="VerbatimChar"/>
+              </w:rPr>
+              <w:t xml:space="preserve">IX_Document_HolderId</w:t>
+            </w:r>
+            <w:r>
+              <w:t xml:space="preserve">,</w:t>
+            </w:r>
+            <w:r>
+              <w:t xml:space="preserve"> </w:t>
+            </w:r>
+            <w:r>
+              <w:rPr>
+                <w:rStyle w:val="VerbatimChar"/>
+              </w:rPr>
+              <w:t xml:space="preserve">IX_Document_ExpiryDate</w:t>
+            </w:r>
+            <w:r>
+              <w:t xml:space="preserve">,</w:t>
+            </w:r>
+            <w:r>
+              <w:t xml:space="preserve"> </w:t>
+            </w:r>
+            <w:r>
+              <w:rPr>
+                <w:rStyle w:val="VerbatimChar"/>
+              </w:rPr>
+              <w:t xml:space="preserve">IX_Attachment_DocumentId</w:t>
+            </w:r>
+          </w:p>
+        </w:tc>
+        <w:tc>
+          <w:tcPr/>
+          <w:p>
+            <w:pPr>
+              <w:pStyle w:val="Compact"/>
+            </w:pPr>
+            <w:r>
+              <w:t xml:space="preserve">1.5</w:t>
             </w:r>
           </w:p>
         </w:tc>

</xml_diff>

<commit_message>
step(2.2): add ReminderRule with ReminderOffsets value object and migration
Learned: EF value conversion vs owned types, ValueComparer necessity, flags enums in EF, TimeOnly mapping, IANA time zone validation, defaults-on-first-use

Co-Authored-By: Claude Fable 5 <noreply@anthropic.com>
Claude-Session: https://claude.ai/code/session_01XCaaD2oSfQhWv3vNENZDue
</commit_message>
<xml_diff>
--- a/docs/deliverables/out/Database.docx
+++ b/docs/deliverables/out/Database.docx
@@ -556,6 +556,129 @@
             </w:r>
             <w:r>
               <w:t xml:space="preserve">schema initial (empty) migration — Reminders module skeleton (2.1)</w:t>
+            </w:r>
+          </w:p>
+        </w:tc>
+      </w:tr>
+      <w:tr>
+        <w:tc>
+          <w:tcPr/>
+          <w:p>
+            <w:pPr>
+              <w:pStyle w:val="Compact"/>
+              <w:jc w:val="left"/>
+            </w:pPr>
+            <w:r>
+              <w:t xml:space="preserve">0.1.5</w:t>
+            </w:r>
+          </w:p>
+        </w:tc>
+        <w:tc>
+          <w:tcPr/>
+          <w:p>
+            <w:pPr>
+              <w:pStyle w:val="Compact"/>
+              <w:jc w:val="left"/>
+            </w:pPr>
+            <w:r>
+              <w:t xml:space="preserve">2026-08-27</w:t>
+            </w:r>
+          </w:p>
+        </w:tc>
+        <w:tc>
+          <w:tcPr/>
+          <w:p>
+            <w:pPr>
+              <w:pStyle w:val="Compact"/>
+              <w:jc w:val="left"/>
+            </w:pPr>
+            <w:r>
+              <w:t xml:space="preserve">Abdulsalam</w:t>
+            </w:r>
+          </w:p>
+        </w:tc>
+        <w:tc>
+          <w:tcPr/>
+          <w:p>
+            <w:pPr>
+              <w:pStyle w:val="Compact"/>
+              <w:jc w:val="left"/>
+            </w:pPr>
+            <w:r>
+              <w:t xml:space="preserve">Migrations log row 6:</w:t>
+            </w:r>
+            <w:r>
+              <w:t xml:space="preserve"> </w:t>
+            </w:r>
+            <w:r>
+              <w:rPr>
+                <w:rStyle w:val="VerbatimChar"/>
+              </w:rPr>
+              <w:t xml:space="preserve">ReminderRule</w:t>
+            </w:r>
+            <w:r>
+              <w:t xml:space="preserve"> </w:t>
+            </w:r>
+            <w:r>
+              <w:t xml:space="preserve">table (2.2);</w:t>
+            </w:r>
+            <w:r>
+              <w:t xml:space="preserve"> </w:t>
+            </w:r>
+            <w:r>
+              <w:rPr>
+                <w:rStyle w:val="VerbatimChar"/>
+              </w:rPr>
+              <w:t xml:space="preserve">ReminderRule</w:t>
+            </w:r>
+            <w:r>
+              <w:t xml:space="preserve"> </w:t>
+            </w:r>
+            <w:r>
+              <w:t xml:space="preserve">marked</w:t>
+            </w:r>
+            <w:r>
+              <w:t xml:space="preserve"> </w:t>
+            </w:r>
+            <w:r>
+              <w:rPr>
+                <w:iCs/>
+                <w:i/>
+              </w:rPr>
+              <w:t xml:space="preserve">Implemented</w:t>
+            </w:r>
+            <w:r>
+              <w:t xml:space="preserve">,</w:t>
+            </w:r>
+            <w:r>
+              <w:t xml:space="preserve"> </w:t>
+            </w:r>
+            <w:r>
+              <w:rPr>
+                <w:rStyle w:val="VerbatimChar"/>
+              </w:rPr>
+              <w:t xml:space="preserve">OffsetsDays</w:t>
+            </w:r>
+            <w:r>
+              <w:t xml:space="preserve"> </w:t>
+            </w:r>
+            <w:r>
+              <w:t xml:space="preserve">documented as the</w:t>
+            </w:r>
+            <w:r>
+              <w:t xml:space="preserve"> </w:t>
+            </w:r>
+            <w:r>
+              <w:rPr>
+                <w:rStyle w:val="VerbatimChar"/>
+              </w:rPr>
+              <w:t xml:space="preserve">ReminderOffsets</w:t>
+            </w:r>
+            <w:r>
+              <w:t xml:space="preserve"> </w:t>
+            </w:r>
+            <w:r>
+              <w:t xml:space="preserve">value object</w:t>
             </w:r>
           </w:p>
         </w:tc>
@@ -5057,7 +5180,7 @@
         <w:t xml:space="preserve">reminders</w:t>
       </w:r>
     </w:p>
-    <w:bookmarkStart w:id="34" w:name="reminders.reminderrule-e-reminderrule"/>
+    <w:bookmarkStart w:id="34" w:name="X7563565d6b03967ca0604bf724b650a78d0b147"/>
     <w:p>
       <w:pPr>
         <w:pStyle w:val="Heading3"/>
@@ -5081,7 +5204,17 @@
         <w:t xml:space="preserve"> </w:t>
       </w:r>
       <w:r>
-        <w:t xml:space="preserve">(E-ReminderRule)</w:t>
+        <w:t xml:space="preserve">(E-ReminderRule) —</w:t>
+      </w:r>
+      <w:r>
+        <w:t xml:space="preserve"> </w:t>
+      </w:r>
+      <w:r>
+        <w:rPr>
+          <w:iCs/>
+          <w:i/>
+        </w:rPr>
+        <w:t xml:space="preserve">Implemented (2.2)</w:t>
       </w:r>
     </w:p>
     <w:tbl>
@@ -11019,6 +11152,152 @@
             </w:pPr>
             <w:r>
               <w:t xml:space="preserve">2.1</w:t>
+            </w:r>
+          </w:p>
+        </w:tc>
+      </w:tr>
+      <w:tr>
+        <w:tc>
+          <w:tcPr/>
+          <w:p>
+            <w:pPr>
+              <w:pStyle w:val="Compact"/>
+              <w:jc w:val="left"/>
+            </w:pPr>
+            <w:r>
+              <w:t xml:space="preserve">6</w:t>
+            </w:r>
+          </w:p>
+        </w:tc>
+        <w:tc>
+          <w:tcPr/>
+          <w:p>
+            <w:pPr>
+              <w:pStyle w:val="Compact"/>
+              <w:jc w:val="left"/>
+            </w:pPr>
+            <w:r>
+              <w:t xml:space="preserve">2026-08-27</w:t>
+            </w:r>
+          </w:p>
+        </w:tc>
+        <w:tc>
+          <w:tcPr/>
+          <w:p>
+            <w:pPr>
+              <w:pStyle w:val="Compact"/>
+              <w:jc w:val="left"/>
+            </w:pPr>
+            <w:r>
+              <w:t xml:space="preserve">Reminders</w:t>
+            </w:r>
+          </w:p>
+        </w:tc>
+        <w:tc>
+          <w:tcPr/>
+          <w:p>
+            <w:pPr>
+              <w:pStyle w:val="Compact"/>
+              <w:jc w:val="left"/>
+            </w:pPr>
+            <w:r>
+              <w:rPr>
+                <w:rStyle w:val="VerbatimChar"/>
+              </w:rPr>
+              <w:t xml:space="preserve">20260827150810_AddReminderRule</w:t>
+            </w:r>
+            <w:r>
+              <w:t xml:space="preserve"> </w:t>
+            </w:r>
+            <w:r>
+              <w:t xml:space="preserve">— table</w:t>
+            </w:r>
+            <w:r>
+              <w:t xml:space="preserve"> </w:t>
+            </w:r>
+            <w:r>
+              <w:rPr>
+                <w:rStyle w:val="VerbatimChar"/>
+              </w:rPr>
+              <w:t xml:space="preserve">ReminderRule</w:t>
+            </w:r>
+            <w:r>
+              <w:t xml:space="preserve"> </w:t>
+            </w:r>
+            <w:r>
+              <w:t xml:space="preserve">(</w:t>
+            </w:r>
+            <w:r>
+              <w:rPr>
+                <w:rStyle w:val="VerbatimChar"/>
+              </w:rPr>
+              <w:t xml:space="preserve">OffsetsDays</w:t>
+            </w:r>
+            <w:r>
+              <w:t xml:space="preserve"> </w:t>
+            </w:r>
+            <w:r>
+              <w:t xml:space="preserve">CSV via value conversion,</w:t>
+            </w:r>
+            <w:r>
+              <w:t xml:space="preserve"> </w:t>
+            </w:r>
+            <w:r>
+              <w:rPr>
+                <w:rStyle w:val="VerbatimChar"/>
+              </w:rPr>
+              <w:t xml:space="preserve">Channels</w:t>
+            </w:r>
+            <w:r>
+              <w:t xml:space="preserve"> </w:t>
+            </w:r>
+            <w:r>
+              <w:t xml:space="preserve">tinyint flags, quiet hours</w:t>
+            </w:r>
+            <w:r>
+              <w:t xml:space="preserve"> </w:t>
+            </w:r>
+            <w:r>
+              <w:rPr>
+                <w:rStyle w:val="VerbatimChar"/>
+              </w:rPr>
+              <w:t xml:space="preserve">time</w:t>
+            </w:r>
+            <w:r>
+              <w:t xml:space="preserve">,</w:t>
+            </w:r>
+            <w:r>
+              <w:t xml:space="preserve"> </w:t>
+            </w:r>
+            <w:r>
+              <w:rPr>
+                <w:rStyle w:val="VerbatimChar"/>
+              </w:rPr>
+              <w:t xml:space="preserve">TimeZoneId</w:t>
+            </w:r>
+            <w:r>
+              <w:t xml:space="preserve">); unique</w:t>
+            </w:r>
+            <w:r>
+              <w:t xml:space="preserve"> </w:t>
+            </w:r>
+            <w:r>
+              <w:rPr>
+                <w:rStyle w:val="VerbatimChar"/>
+              </w:rPr>
+              <w:t xml:space="preserve">UQ_ReminderRule_UserId</w:t>
+            </w:r>
+          </w:p>
+        </w:tc>
+        <w:tc>
+          <w:tcPr/>
+          <w:p>
+            <w:pPr>
+              <w:pStyle w:val="Compact"/>
+              <w:jc w:val="left"/>
+            </w:pPr>
+            <w:r>
+              <w:t xml:space="preserve">2.2</w:t>
             </w:r>
           </w:p>
         </w:tc>

</xml_diff>

<commit_message>
step(2.3): add Reminder, DeliveryLog and the ReminderScheduler domain service
Learned: pure-core/thin-IO scheduling math, per-user today via time zones, upsert-by-reuse under a unique index, aggregate state machines, UTC clock via AbpClockOptions, wiring the SQLite test host

Co-Authored-By: Claude Fable 5 <noreply@anthropic.com>
Claude-Session: https://claude.ai/code/session_01XCaaD2oSfQhWv3vNENZDue
</commit_message>
<xml_diff>
--- a/docs/deliverables/out/Database.docx
+++ b/docs/deliverables/out/Database.docx
@@ -679,6 +679,96 @@
             </w:r>
             <w:r>
               <w:t xml:space="preserve">value object</w:t>
+            </w:r>
+          </w:p>
+        </w:tc>
+      </w:tr>
+      <w:tr>
+        <w:tc>
+          <w:tcPr/>
+          <w:p>
+            <w:pPr>
+              <w:pStyle w:val="Compact"/>
+              <w:jc w:val="left"/>
+            </w:pPr>
+            <w:r>
+              <w:t xml:space="preserve">0.1.6</w:t>
+            </w:r>
+          </w:p>
+        </w:tc>
+        <w:tc>
+          <w:tcPr/>
+          <w:p>
+            <w:pPr>
+              <w:pStyle w:val="Compact"/>
+              <w:jc w:val="left"/>
+            </w:pPr>
+            <w:r>
+              <w:t xml:space="preserve">2026-08-28</w:t>
+            </w:r>
+          </w:p>
+        </w:tc>
+        <w:tc>
+          <w:tcPr/>
+          <w:p>
+            <w:pPr>
+              <w:pStyle w:val="Compact"/>
+              <w:jc w:val="left"/>
+            </w:pPr>
+            <w:r>
+              <w:t xml:space="preserve">Abdulsalam</w:t>
+            </w:r>
+          </w:p>
+        </w:tc>
+        <w:tc>
+          <w:tcPr/>
+          <w:p>
+            <w:pPr>
+              <w:pStyle w:val="Compact"/>
+              <w:jc w:val="left"/>
+            </w:pPr>
+            <w:r>
+              <w:t xml:space="preserve">Migrations log row 7:</w:t>
+            </w:r>
+            <w:r>
+              <w:t xml:space="preserve"> </w:t>
+            </w:r>
+            <w:r>
+              <w:rPr>
+                <w:rStyle w:val="VerbatimChar"/>
+              </w:rPr>
+              <w:t xml:space="preserve">Reminder</w:t>
+            </w:r>
+            <w:r>
+              <w:t xml:space="preserve"> </w:t>
+            </w:r>
+            <w:r>
+              <w:t xml:space="preserve">+</w:t>
+            </w:r>
+            <w:r>
+              <w:t xml:space="preserve"> </w:t>
+            </w:r>
+            <w:r>
+              <w:rPr>
+                <w:rStyle w:val="VerbatimChar"/>
+              </w:rPr>
+              <w:t xml:space="preserve">DeliveryLog</w:t>
+            </w:r>
+            <w:r>
+              <w:t xml:space="preserve"> </w:t>
+            </w:r>
+            <w:r>
+              <w:t xml:space="preserve">tables (2.3); both marked</w:t>
+            </w:r>
+            <w:r>
+              <w:t xml:space="preserve"> </w:t>
+            </w:r>
+            <w:r>
+              <w:rPr>
+                <w:iCs/>
+                <w:i/>
+              </w:rPr>
+              <w:t xml:space="preserve">Implemented</w:t>
             </w:r>
           </w:p>
         </w:tc>
@@ -5652,7 +5742,7 @@
       </w:tr>
     </w:tbl>
     <w:bookmarkEnd w:id="34"/>
-    <w:bookmarkStart w:id="35" w:name="reminders.reminder-e-reminder"/>
+    <w:bookmarkStart w:id="35" w:name="Xda8c76578f8c76a213214ec1ee00cba62d715b9"/>
     <w:p>
       <w:pPr>
         <w:pStyle w:val="Heading3"/>
@@ -5676,7 +5766,17 @@
         <w:t xml:space="preserve"> </w:t>
       </w:r>
       <w:r>
-        <w:t xml:space="preserve">(E-Reminder)</w:t>
+        <w:t xml:space="preserve">(E-Reminder) —</w:t>
+      </w:r>
+      <w:r>
+        <w:t xml:space="preserve"> </w:t>
+      </w:r>
+      <w:r>
+        <w:rPr>
+          <w:iCs/>
+          <w:i/>
+        </w:rPr>
+        <w:t xml:space="preserve">Implemented (2.3)</w:t>
       </w:r>
     </w:p>
     <w:tbl>
@@ -6146,7 +6246,7 @@
       </w:r>
     </w:p>
     <w:bookmarkEnd w:id="35"/>
-    <w:bookmarkStart w:id="36" w:name="reminders.deliverylog-e-deliverylog"/>
+    <w:bookmarkStart w:id="36" w:name="X8fca292fd109f615f6799e7c1a1fa11aeca636a"/>
     <w:p>
       <w:pPr>
         <w:pStyle w:val="Heading3"/>
@@ -6170,7 +6270,17 @@
         <w:t xml:space="preserve"> </w:t>
       </w:r>
       <w:r>
-        <w:t xml:space="preserve">(E-DeliveryLog)</w:t>
+        <w:t xml:space="preserve">(E-DeliveryLog) —</w:t>
+      </w:r>
+      <w:r>
+        <w:t xml:space="preserve"> </w:t>
+      </w:r>
+      <w:r>
+        <w:rPr>
+          <w:iCs/>
+          <w:i/>
+        </w:rPr>
+        <w:t xml:space="preserve">Implemented (2.3)</w:t>
       </w:r>
     </w:p>
     <w:tbl>
@@ -11298,6 +11408,155 @@
             </w:pPr>
             <w:r>
               <w:t xml:space="preserve">2.2</w:t>
+            </w:r>
+          </w:p>
+        </w:tc>
+      </w:tr>
+      <w:tr>
+        <w:tc>
+          <w:tcPr/>
+          <w:p>
+            <w:pPr>
+              <w:pStyle w:val="Compact"/>
+              <w:jc w:val="left"/>
+            </w:pPr>
+            <w:r>
+              <w:t xml:space="preserve">7</w:t>
+            </w:r>
+          </w:p>
+        </w:tc>
+        <w:tc>
+          <w:tcPr/>
+          <w:p>
+            <w:pPr>
+              <w:pStyle w:val="Compact"/>
+              <w:jc w:val="left"/>
+            </w:pPr>
+            <w:r>
+              <w:t xml:space="preserve">2026-08-28</w:t>
+            </w:r>
+          </w:p>
+        </w:tc>
+        <w:tc>
+          <w:tcPr/>
+          <w:p>
+            <w:pPr>
+              <w:pStyle w:val="Compact"/>
+              <w:jc w:val="left"/>
+            </w:pPr>
+            <w:r>
+              <w:t xml:space="preserve">Reminders</w:t>
+            </w:r>
+          </w:p>
+        </w:tc>
+        <w:tc>
+          <w:tcPr/>
+          <w:p>
+            <w:pPr>
+              <w:pStyle w:val="Compact"/>
+              <w:jc w:val="left"/>
+            </w:pPr>
+            <w:r>
+              <w:rPr>
+                <w:rStyle w:val="VerbatimChar"/>
+              </w:rPr>
+              <w:t xml:space="preserve">20260828051505_AddReminderAndDeliveryLog</w:t>
+            </w:r>
+            <w:r>
+              <w:t xml:space="preserve"> </w:t>
+            </w:r>
+            <w:r>
+              <w:t xml:space="preserve">— tables</w:t>
+            </w:r>
+            <w:r>
+              <w:t xml:space="preserve"> </w:t>
+            </w:r>
+            <w:r>
+              <w:rPr>
+                <w:rStyle w:val="VerbatimChar"/>
+              </w:rPr>
+              <w:t xml:space="preserve">Reminder</w:t>
+            </w:r>
+            <w:r>
+              <w:t xml:space="preserve"> </w:t>
+            </w:r>
+            <w:r>
+              <w:t xml:space="preserve">(unique</w:t>
+            </w:r>
+            <w:r>
+              <w:t xml:space="preserve"> </w:t>
+            </w:r>
+            <w:r>
+              <w:rPr>
+                <w:rStyle w:val="VerbatimChar"/>
+              </w:rPr>
+              <w:t xml:space="preserve">UQ_Reminder_DocumentId_OffsetDays</w:t>
+            </w:r>
+            <w:r>
+              <w:t xml:space="preserve">,</w:t>
+            </w:r>
+            <w:r>
+              <w:t xml:space="preserve"> </w:t>
+            </w:r>
+            <w:r>
+              <w:rPr>
+                <w:rStyle w:val="VerbatimChar"/>
+              </w:rPr>
+              <w:t xml:space="preserve">IX_Reminder_Status_DueDate</w:t>
+            </w:r>
+            <w:r>
+              <w:t xml:space="preserve">,</w:t>
+            </w:r>
+            <w:r>
+              <w:t xml:space="preserve"> </w:t>
+            </w:r>
+            <w:r>
+              <w:rPr>
+                <w:rStyle w:val="VerbatimChar"/>
+              </w:rPr>
+              <w:t xml:space="preserve">IX_Reminder_UserId</w:t>
+            </w:r>
+            <w:r>
+              <w:t xml:space="preserve">),</w:t>
+            </w:r>
+            <w:r>
+              <w:t xml:space="preserve"> </w:t>
+            </w:r>
+            <w:r>
+              <w:rPr>
+                <w:rStyle w:val="VerbatimChar"/>
+              </w:rPr>
+              <w:t xml:space="preserve">DeliveryLog</w:t>
+            </w:r>
+            <w:r>
+              <w:t xml:space="preserve"> </w:t>
+            </w:r>
+            <w:r>
+              <w:t xml:space="preserve">(FK to Reminder, Cascade;</w:t>
+            </w:r>
+            <w:r>
+              <w:t xml:space="preserve"> </w:t>
+            </w:r>
+            <w:r>
+              <w:rPr>
+                <w:rStyle w:val="VerbatimChar"/>
+              </w:rPr>
+              <w:t xml:space="preserve">IX_DeliveryLog_ReminderId</w:t>
+            </w:r>
+            <w:r>
+              <w:t xml:space="preserve">)</w:t>
+            </w:r>
+          </w:p>
+        </w:tc>
+        <w:tc>
+          <w:tcPr/>
+          <w:p>
+            <w:pPr>
+              <w:pStyle w:val="Compact"/>
+              <w:jc w:val="left"/>
+            </w:pPr>
+            <w:r>
+              <w:t xml:space="preserve">2.3</w:t>
             </w:r>
           </w:p>
         </w:tc>

</xml_diff>

<commit_message>
step(3.2): add the Ai module skeleton with the ai.Usage ledger
Learned: module recipe as a checklist, append-only ledger modeling with BasicAggregateRoot, nullable owners for system jobs, single-purpose indexes, when skeleton isolation stops paying

Co-Authored-By: Claude Fable 5 <noreply@anthropic.com>
Claude-Session: https://claude.ai/code/session_01XCaaD2oSfQhWv3vNENZDue
</commit_message>
<xml_diff>
--- a/docs/deliverables/out/Database.docx
+++ b/docs/deliverables/out/Database.docx
@@ -759,6 +759,111 @@
             </w:r>
             <w:r>
               <w:t xml:space="preserve">tables (2.3); both marked</w:t>
+            </w:r>
+            <w:r>
+              <w:t xml:space="preserve"> </w:t>
+            </w:r>
+            <w:r>
+              <w:rPr>
+                <w:iCs/>
+                <w:i/>
+              </w:rPr>
+              <w:t xml:space="preserve">Implemented</w:t>
+            </w:r>
+          </w:p>
+        </w:tc>
+      </w:tr>
+      <w:tr>
+        <w:tc>
+          <w:tcPr/>
+          <w:p>
+            <w:pPr>
+              <w:pStyle w:val="Compact"/>
+              <w:jc w:val="left"/>
+            </w:pPr>
+            <w:r>
+              <w:t xml:space="preserve">0.1.7</w:t>
+            </w:r>
+          </w:p>
+        </w:tc>
+        <w:tc>
+          <w:tcPr/>
+          <w:p>
+            <w:pPr>
+              <w:pStyle w:val="Compact"/>
+              <w:jc w:val="left"/>
+            </w:pPr>
+            <w:r>
+              <w:t xml:space="preserve">2026-08-28</w:t>
+            </w:r>
+          </w:p>
+        </w:tc>
+        <w:tc>
+          <w:tcPr/>
+          <w:p>
+            <w:pPr>
+              <w:pStyle w:val="Compact"/>
+              <w:jc w:val="left"/>
+            </w:pPr>
+            <w:r>
+              <w:t xml:space="preserve">Abdulsalam</w:t>
+            </w:r>
+          </w:p>
+        </w:tc>
+        <w:tc>
+          <w:tcPr/>
+          <w:p>
+            <w:pPr>
+              <w:pStyle w:val="Compact"/>
+              <w:jc w:val="left"/>
+            </w:pPr>
+            <w:r>
+              <w:t xml:space="preserve">Migrations log row 8:</w:t>
+            </w:r>
+            <w:r>
+              <w:t xml:space="preserve"> </w:t>
+            </w:r>
+            <w:r>
+              <w:rPr>
+                <w:rStyle w:val="VerbatimChar"/>
+              </w:rPr>
+              <w:t xml:space="preserve">ai</w:t>
+            </w:r>
+            <w:r>
+              <w:t xml:space="preserve"> </w:t>
+            </w:r>
+            <w:r>
+              <w:t xml:space="preserve">schema +</w:t>
+            </w:r>
+            <w:r>
+              <w:t xml:space="preserve"> </w:t>
+            </w:r>
+            <w:r>
+              <w:rPr>
+                <w:rStyle w:val="VerbatimChar"/>
+              </w:rPr>
+              <w:t xml:space="preserve">Usage</w:t>
+            </w:r>
+            <w:r>
+              <w:t xml:space="preserve"> </w:t>
+            </w:r>
+            <w:r>
+              <w:t xml:space="preserve">table (3.2);</w:t>
+            </w:r>
+            <w:r>
+              <w:t xml:space="preserve"> </w:t>
+            </w:r>
+            <w:r>
+              <w:rPr>
+                <w:rStyle w:val="VerbatimChar"/>
+              </w:rPr>
+              <w:t xml:space="preserve">Usage</w:t>
+            </w:r>
+            <w:r>
+              <w:t xml:space="preserve"> </w:t>
+            </w:r>
+            <w:r>
+              <w:t xml:space="preserve">marked</w:t>
             </w:r>
             <w:r>
               <w:t xml:space="preserve"> </w:t>
@@ -9199,7 +9304,7 @@
       </w:tr>
     </w:tbl>
     <w:bookmarkEnd w:id="44"/>
-    <w:bookmarkStart w:id="45" w:name="ai.usage-e-usage"/>
+    <w:bookmarkStart w:id="45" w:name="ai.usage-e-usage-implemented-3.2"/>
     <w:p>
       <w:pPr>
         <w:pStyle w:val="Heading3"/>
@@ -9223,7 +9328,17 @@
         <w:t xml:space="preserve"> </w:t>
       </w:r>
       <w:r>
-        <w:t xml:space="preserve">(E-Usage)</w:t>
+        <w:t xml:space="preserve">(E-Usage) —</w:t>
+      </w:r>
+      <w:r>
+        <w:t xml:space="preserve"> </w:t>
+      </w:r>
+      <w:r>
+        <w:rPr>
+          <w:iCs/>
+          <w:i/>
+        </w:rPr>
+        <w:t xml:space="preserve">Implemented (3.2)</w:t>
       </w:r>
     </w:p>
     <w:tbl>
@@ -11557,6 +11672,134 @@
             </w:pPr>
             <w:r>
               <w:t xml:space="preserve">2.3</w:t>
+            </w:r>
+          </w:p>
+        </w:tc>
+      </w:tr>
+      <w:tr>
+        <w:tc>
+          <w:tcPr/>
+          <w:p>
+            <w:pPr>
+              <w:pStyle w:val="Compact"/>
+              <w:jc w:val="left"/>
+            </w:pPr>
+            <w:r>
+              <w:t xml:space="preserve">8</w:t>
+            </w:r>
+          </w:p>
+        </w:tc>
+        <w:tc>
+          <w:tcPr/>
+          <w:p>
+            <w:pPr>
+              <w:pStyle w:val="Compact"/>
+              <w:jc w:val="left"/>
+            </w:pPr>
+            <w:r>
+              <w:t xml:space="preserve">2026-08-28</w:t>
+            </w:r>
+          </w:p>
+        </w:tc>
+        <w:tc>
+          <w:tcPr/>
+          <w:p>
+            <w:pPr>
+              <w:pStyle w:val="Compact"/>
+              <w:jc w:val="left"/>
+            </w:pPr>
+            <w:r>
+              <w:t xml:space="preserve">Ai (</w:t>
+            </w:r>
+            <w:r>
+              <w:rPr>
+                <w:rStyle w:val="VerbatimChar"/>
+              </w:rPr>
+              <w:t xml:space="preserve">AiDbContext</w:t>
+            </w:r>
+            <w:r>
+              <w:t xml:space="preserve">, schema</w:t>
+            </w:r>
+            <w:r>
+              <w:t xml:space="preserve"> </w:t>
+            </w:r>
+            <w:r>
+              <w:rPr>
+                <w:rStyle w:val="VerbatimChar"/>
+              </w:rPr>
+              <w:t xml:space="preserve">ai</w:t>
+            </w:r>
+            <w:r>
+              <w:t xml:space="preserve">)</w:t>
+            </w:r>
+          </w:p>
+        </w:tc>
+        <w:tc>
+          <w:tcPr/>
+          <w:p>
+            <w:pPr>
+              <w:pStyle w:val="Compact"/>
+              <w:jc w:val="left"/>
+            </w:pPr>
+            <w:r>
+              <w:rPr>
+                <w:rStyle w:val="VerbatimChar"/>
+              </w:rPr>
+              <w:t xml:space="preserve">20260828194653_Initial</w:t>
+            </w:r>
+            <w:r>
+              <w:t xml:space="preserve"> </w:t>
+            </w:r>
+            <w:r>
+              <w:t xml:space="preserve">— schema,</w:t>
+            </w:r>
+            <w:r>
+              <w:t xml:space="preserve"> </w:t>
+            </w:r>
+            <w:r>
+              <w:rPr>
+                <w:rStyle w:val="VerbatimChar"/>
+              </w:rPr>
+              <w:t xml:space="preserve">ai.__EFMigrationsHistory</w:t>
+            </w:r>
+            <w:r>
+              <w:t xml:space="preserve">, table</w:t>
+            </w:r>
+            <w:r>
+              <w:t xml:space="preserve"> </w:t>
+            </w:r>
+            <w:r>
+              <w:rPr>
+                <w:rStyle w:val="VerbatimChar"/>
+              </w:rPr>
+              <w:t xml:space="preserve">Usage</w:t>
+            </w:r>
+            <w:r>
+              <w:t xml:space="preserve"> </w:t>
+            </w:r>
+            <w:r>
+              <w:t xml:space="preserve">(</w:t>
+            </w:r>
+            <w:r>
+              <w:rPr>
+                <w:rStyle w:val="VerbatimChar"/>
+              </w:rPr>
+              <w:t xml:space="preserve">IX_Usage_UserId_At</w:t>
+            </w:r>
+            <w:r>
+              <w:t xml:space="preserve">)</w:t>
+            </w:r>
+          </w:p>
+        </w:tc>
+        <w:tc>
+          <w:tcPr/>
+          <w:p>
+            <w:pPr>
+              <w:pStyle w:val="Compact"/>
+              <w:jc w:val="left"/>
+            </w:pPr>
+            <w:r>
+              <w:t xml:space="preserve">3.2</w:t>
             </w:r>
           </w:p>
         </w:tc>

</xml_diff>

<commit_message>
step(3.6): turn OcrText into a validated proposal behind a versioned prompt
Learned: structured output with parser-as-authority, prompt-as-artifact via embedded resources, defense against model output, append-only results with one-shot verdicts, keyed-client seams

Co-Authored-By: Claude Fable 5 <noreply@anthropic.com>
Claude-Session: https://claude.ai/code/session_01XCaaD2oSfQhWv3vNENZDue
</commit_message>
<xml_diff>
--- a/docs/deliverables/out/Database.docx
+++ b/docs/deliverables/out/Database.docx
@@ -73,7 +73,7 @@
         <w:pStyle w:val="Date"/>
       </w:pPr>
       <w:r>
-        <w:t xml:space="preserve">2026-08-27</w:t>
+        <w:t xml:space="preserve">2026-08-29</w:t>
       </w:r>
     </w:p>
     <w:sdt>
@@ -874,6 +874,114 @@
                 <w:i/>
               </w:rPr>
               <w:t xml:space="preserve">Implemented</w:t>
+            </w:r>
+          </w:p>
+        </w:tc>
+      </w:tr>
+      <w:tr>
+        <w:tc>
+          <w:tcPr/>
+          <w:p>
+            <w:pPr>
+              <w:pStyle w:val="Compact"/>
+              <w:jc w:val="left"/>
+            </w:pPr>
+            <w:r>
+              <w:t xml:space="preserve">0.1.8</w:t>
+            </w:r>
+          </w:p>
+        </w:tc>
+        <w:tc>
+          <w:tcPr/>
+          <w:p>
+            <w:pPr>
+              <w:pStyle w:val="Compact"/>
+              <w:jc w:val="left"/>
+            </w:pPr>
+            <w:r>
+              <w:t xml:space="preserve">2026-08-29</w:t>
+            </w:r>
+          </w:p>
+        </w:tc>
+        <w:tc>
+          <w:tcPr/>
+          <w:p>
+            <w:pPr>
+              <w:pStyle w:val="Compact"/>
+              <w:jc w:val="left"/>
+            </w:pPr>
+            <w:r>
+              <w:t xml:space="preserve">Abdulsalam</w:t>
+            </w:r>
+          </w:p>
+        </w:tc>
+        <w:tc>
+          <w:tcPr/>
+          <w:p>
+            <w:pPr>
+              <w:pStyle w:val="Compact"/>
+              <w:jc w:val="left"/>
+            </w:pPr>
+            <w:r>
+              <w:t xml:space="preserve">Migrations log row 9:</w:t>
+            </w:r>
+            <w:r>
+              <w:t xml:space="preserve"> </w:t>
+            </w:r>
+            <w:r>
+              <w:rPr>
+                <w:rStyle w:val="VerbatimChar"/>
+              </w:rPr>
+              <w:t xml:space="preserve">ExtractionResult</w:t>
+            </w:r>
+            <w:r>
+              <w:t xml:space="preserve"> </w:t>
+            </w:r>
+            <w:r>
+              <w:t xml:space="preserve">table (3.6), marked</w:t>
+            </w:r>
+            <w:r>
+              <w:t xml:space="preserve"> </w:t>
+            </w:r>
+            <w:r>
+              <w:rPr>
+                <w:iCs/>
+                <w:i/>
+              </w:rPr>
+              <w:t xml:space="preserve">Implemented</w:t>
+            </w:r>
+            <w:r>
+              <w:t xml:space="preserve">;</w:t>
+            </w:r>
+            <w:r>
+              <w:t xml:space="preserve"> </w:t>
+            </w:r>
+            <w:r>
+              <w:rPr>
+                <w:rStyle w:val="VerbatimChar"/>
+              </w:rPr>
+              <w:t xml:space="preserve">PromptVersion</w:t>
+            </w:r>
+            <w:r>
+              <w:t xml:space="preserve"> </w:t>
+            </w:r>
+            <w:r>
+              <w:t xml:space="preserve">widened 16→32 (real ids like</w:t>
+            </w:r>
+            <w:r>
+              <w:t xml:space="preserve"> </w:t>
+            </w:r>
+            <w:r>
+              <w:rPr>
+                <w:rStyle w:val="VerbatimChar"/>
+              </w:rPr>
+              <w:t xml:space="preserve">extract-document@v1</w:t>
+            </w:r>
+            <w:r>
+              <w:t xml:space="preserve"> </w:t>
+            </w:r>
+            <w:r>
+              <w:t xml:space="preserve">are 19 chars)</w:t>
             </w:r>
           </w:p>
         </w:tc>
@@ -4379,7 +4487,7 @@
       </w:tr>
     </w:tbl>
     <w:bookmarkEnd w:id="30"/>
-    <w:bookmarkStart w:id="31" w:name="X23ad5de2e0180b8fc622d7278a61348396a4a3d"/>
+    <w:bookmarkStart w:id="31" w:name="X43fb7cf20d033d9376d067f3cf64724667384bf"/>
     <w:p>
       <w:pPr>
         <w:pStyle w:val="Heading3"/>
@@ -4403,7 +4511,17 @@
         <w:t xml:space="preserve"> </w:t>
       </w:r>
       <w:r>
-        <w:t xml:space="preserve">(E-ExtractionResult)</w:t>
+        <w:t xml:space="preserve">(E-ExtractionResult) —</w:t>
+      </w:r>
+      <w:r>
+        <w:t xml:space="preserve"> </w:t>
+      </w:r>
+      <w:r>
+        <w:rPr>
+          <w:iCs/>
+          <w:i/>
+        </w:rPr>
+        <w:t xml:space="preserve">Implemented (3.6)</w:t>
       </w:r>
     </w:p>
     <w:tbl>
@@ -4567,7 +4685,7 @@
               <w:jc w:val="left"/>
             </w:pPr>
             <w:r>
-              <w:t xml:space="preserve">FK → Attachment; IX</w:t>
+              <w:t xml:space="preserve">FK → Attachment (Cascade: no orphaned extraction PII); IX</w:t>
             </w:r>
           </w:p>
         </w:tc>
@@ -4708,7 +4826,7 @@
               <w:jc w:val="left"/>
             </w:pPr>
             <w:r>
-              <w:t xml:space="preserve">nvarchar(16)</w:t>
+              <w:t xml:space="preserve">nvarchar(32)</w:t>
             </w:r>
           </w:p>
         </w:tc>
@@ -4747,7 +4865,13 @@
               <w:t xml:space="preserve"> </w:t>
             </w:r>
             <w:r>
-              <w:t xml:space="preserve">(no FK)</w:t>
+              <w:t xml:space="preserve">(no FK); e.g. </w:t>
+            </w:r>
+            <w:r>
+              <w:rPr>
+                <w:rStyle w:val="VerbatimChar"/>
+              </w:rPr>
+              <w:t xml:space="preserve">extract-document@v1</w:t>
             </w:r>
           </w:p>
         </w:tc>
@@ -11800,6 +11924,146 @@
             </w:pPr>
             <w:r>
               <w:t xml:space="preserve">3.2</w:t>
+            </w:r>
+          </w:p>
+        </w:tc>
+      </w:tr>
+      <w:tr>
+        <w:tc>
+          <w:tcPr/>
+          <w:p>
+            <w:pPr>
+              <w:pStyle w:val="Compact"/>
+              <w:jc w:val="left"/>
+            </w:pPr>
+            <w:r>
+              <w:t xml:space="preserve">9</w:t>
+            </w:r>
+          </w:p>
+        </w:tc>
+        <w:tc>
+          <w:tcPr/>
+          <w:p>
+            <w:pPr>
+              <w:pStyle w:val="Compact"/>
+              <w:jc w:val="left"/>
+            </w:pPr>
+            <w:r>
+              <w:t xml:space="preserve">2026-08-29</w:t>
+            </w:r>
+          </w:p>
+        </w:tc>
+        <w:tc>
+          <w:tcPr/>
+          <w:p>
+            <w:pPr>
+              <w:pStyle w:val="Compact"/>
+              <w:jc w:val="left"/>
+            </w:pPr>
+            <w:r>
+              <w:t xml:space="preserve">Documents</w:t>
+            </w:r>
+          </w:p>
+        </w:tc>
+        <w:tc>
+          <w:tcPr/>
+          <w:p>
+            <w:pPr>
+              <w:pStyle w:val="Compact"/>
+              <w:jc w:val="left"/>
+            </w:pPr>
+            <w:r>
+              <w:rPr>
+                <w:rStyle w:val="VerbatimChar"/>
+              </w:rPr>
+              <w:t xml:space="preserve">20260829063126_AddExtractionResult</w:t>
+            </w:r>
+            <w:r>
+              <w:t xml:space="preserve"> </w:t>
+            </w:r>
+            <w:r>
+              <w:t xml:space="preserve">— table</w:t>
+            </w:r>
+            <w:r>
+              <w:t xml:space="preserve"> </w:t>
+            </w:r>
+            <w:r>
+              <w:rPr>
+                <w:rStyle w:val="VerbatimChar"/>
+              </w:rPr>
+              <w:t xml:space="preserve">ExtractionResult</w:t>
+            </w:r>
+            <w:r>
+              <w:t xml:space="preserve"> </w:t>
+            </w:r>
+            <w:r>
+              <w:t xml:space="preserve">(FK to</w:t>
+            </w:r>
+            <w:r>
+              <w:t xml:space="preserve"> </w:t>
+            </w:r>
+            <w:r>
+              <w:rPr>
+                <w:rStyle w:val="VerbatimChar"/>
+              </w:rPr>
+              <w:t xml:space="preserve">Attachment</w:t>
+            </w:r>
+            <w:r>
+              <w:t xml:space="preserve">, Cascade;</w:t>
+            </w:r>
+            <w:r>
+              <w:t xml:space="preserve"> </w:t>
+            </w:r>
+            <w:r>
+              <w:rPr>
+                <w:rStyle w:val="VerbatimChar"/>
+              </w:rPr>
+              <w:t xml:space="preserve">IX_ExtractionResult_AttachmentId</w:t>
+            </w:r>
+            <w:r>
+              <w:t xml:space="preserve">;</w:t>
+            </w:r>
+            <w:r>
+              <w:t xml:space="preserve"> </w:t>
+            </w:r>
+            <w:r>
+              <w:rPr>
+                <w:rStyle w:val="VerbatimChar"/>
+              </w:rPr>
+              <w:t xml:space="preserve">Confidence</w:t>
+            </w:r>
+            <w:r>
+              <w:t xml:space="preserve"> </w:t>
+            </w:r>
+            <w:r>
+              <w:t xml:space="preserve">decimal(4,3);</w:t>
+            </w:r>
+            <w:r>
+              <w:t xml:space="preserve"> </w:t>
+            </w:r>
+            <w:r>
+              <w:rPr>
+                <w:rStyle w:val="VerbatimChar"/>
+              </w:rPr>
+              <w:t xml:space="preserve">Outcome</w:t>
+            </w:r>
+            <w:r>
+              <w:t xml:space="preserve"> </w:t>
+            </w:r>
+            <w:r>
+              <w:t xml:space="preserve">tinyint)</w:t>
+            </w:r>
+          </w:p>
+        </w:tc>
+        <w:tc>
+          <w:tcPr/>
+          <w:p>
+            <w:pPr>
+              <w:pStyle w:val="Compact"/>
+              <w:jc w:val="left"/>
+            </w:pPr>
+            <w:r>
+              <w:t xml:space="preserve">3.6</w:t>
             </w:r>
           </w:p>
         </w:tc>

</xml_diff>

<commit_message>
step(3.8): prove the cap end to end, ship the eval harness and the ai-safety doc
Learned: evals as regression tests for prompts, nulls as labels, self-validating eval sets, real-composition integration tests, honest safety documentation

Co-Authored-By: Claude Fable 5 <noreply@anthropic.com>
Claude-Session: https://claude.ai/code/session_01XCaaD2oSfQhWv3vNENZDue
</commit_message>
<xml_diff>
--- a/docs/deliverables/out/Database.docx
+++ b/docs/deliverables/out/Database.docx
@@ -982,6 +982,71 @@
             </w:r>
             <w:r>
               <w:t xml:space="preserve">are 19 chars)</w:t>
+            </w:r>
+          </w:p>
+        </w:tc>
+      </w:tr>
+      <w:tr>
+        <w:tc>
+          <w:tcPr/>
+          <w:p>
+            <w:pPr>
+              <w:pStyle w:val="Compact"/>
+              <w:jc w:val="left"/>
+            </w:pPr>
+            <w:r>
+              <w:t xml:space="preserve">0.1.9</w:t>
+            </w:r>
+          </w:p>
+        </w:tc>
+        <w:tc>
+          <w:tcPr/>
+          <w:p>
+            <w:pPr>
+              <w:pStyle w:val="Compact"/>
+              <w:jc w:val="left"/>
+            </w:pPr>
+            <w:r>
+              <w:t xml:space="preserve">2026-08-29</w:t>
+            </w:r>
+          </w:p>
+        </w:tc>
+        <w:tc>
+          <w:tcPr/>
+          <w:p>
+            <w:pPr>
+              <w:pStyle w:val="Compact"/>
+              <w:jc w:val="left"/>
+            </w:pPr>
+            <w:r>
+              <w:t xml:space="preserve">Abdulsalam</w:t>
+            </w:r>
+          </w:p>
+        </w:tc>
+        <w:tc>
+          <w:tcPr/>
+          <w:p>
+            <w:pPr>
+              <w:pStyle w:val="Compact"/>
+              <w:jc w:val="left"/>
+            </w:pPr>
+            <w:r>
+              <w:t xml:space="preserve">Migrations log row 10:</w:t>
+            </w:r>
+            <w:r>
+              <w:t xml:space="preserve"> </w:t>
+            </w:r>
+            <w:r>
+              <w:rPr>
+                <w:rStyle w:val="VerbatimChar"/>
+              </w:rPr>
+              <w:t xml:space="preserve">ai.Usage.PromptVersion</w:t>
+            </w:r>
+            <w:r>
+              <w:t xml:space="preserve"> </w:t>
+            </w:r>
+            <w:r>
+              <w:t xml:space="preserve">widened 16→32 too — the 3.8 end-to-end cap test caught the ledger still on 16</w:t>
             </w:r>
           </w:p>
         </w:tc>
@@ -9825,7 +9890,7 @@
               <w:jc w:val="left"/>
             </w:pPr>
             <w:r>
-              <w:t xml:space="preserve">nvarchar(16)</w:t>
+              <w:t xml:space="preserve">nvarchar(32)</w:t>
             </w:r>
           </w:p>
         </w:tc>
@@ -12064,6 +12129,92 @@
             </w:pPr>
             <w:r>
               <w:t xml:space="preserve">3.6</w:t>
+            </w:r>
+          </w:p>
+        </w:tc>
+      </w:tr>
+      <w:tr>
+        <w:tc>
+          <w:tcPr/>
+          <w:p>
+            <w:pPr>
+              <w:pStyle w:val="Compact"/>
+              <w:jc w:val="left"/>
+            </w:pPr>
+            <w:r>
+              <w:t xml:space="preserve">10</w:t>
+            </w:r>
+          </w:p>
+        </w:tc>
+        <w:tc>
+          <w:tcPr/>
+          <w:p>
+            <w:pPr>
+              <w:pStyle w:val="Compact"/>
+              <w:jc w:val="left"/>
+            </w:pPr>
+            <w:r>
+              <w:t xml:space="preserve">2026-08-29</w:t>
+            </w:r>
+          </w:p>
+        </w:tc>
+        <w:tc>
+          <w:tcPr/>
+          <w:p>
+            <w:pPr>
+              <w:pStyle w:val="Compact"/>
+              <w:jc w:val="left"/>
+            </w:pPr>
+            <w:r>
+              <w:t xml:space="preserve">Ai</w:t>
+            </w:r>
+          </w:p>
+        </w:tc>
+        <w:tc>
+          <w:tcPr/>
+          <w:p>
+            <w:pPr>
+              <w:pStyle w:val="Compact"/>
+              <w:jc w:val="left"/>
+            </w:pPr>
+            <w:r>
+              <w:rPr>
+                <w:rStyle w:val="VerbatimChar"/>
+              </w:rPr>
+              <w:t xml:space="preserve">20260829161139_WidenUsagePromptVersion</w:t>
+            </w:r>
+            <w:r>
+              <w:t xml:space="preserve"> </w:t>
+            </w:r>
+            <w:r>
+              <w:t xml:space="preserve">—</w:t>
+            </w:r>
+            <w:r>
+              <w:t xml:space="preserve"> </w:t>
+            </w:r>
+            <w:r>
+              <w:rPr>
+                <w:rStyle w:val="VerbatimChar"/>
+              </w:rPr>
+              <w:t xml:space="preserve">Usage.PromptVersion</w:t>
+            </w:r>
+            <w:r>
+              <w:t xml:space="preserve"> </w:t>
+            </w:r>
+            <w:r>
+              <w:t xml:space="preserve">nvarchar(16)→nvarchar(32)</w:t>
+            </w:r>
+          </w:p>
+        </w:tc>
+        <w:tc>
+          <w:tcPr/>
+          <w:p>
+            <w:pPr>
+              <w:pStyle w:val="Compact"/>
+              <w:jc w:val="left"/>
+            </w:pPr>
+            <w:r>
+              <w:t xml:space="preserve">3.8</w:t>
             </w:r>
           </w:p>
         </w:tc>

</xml_diff>

<commit_message>
step(5.1): add Guides module skeleton with public-read permission design
Learned: ABP module recipe fifth lap, one module three executables, asymmetric permission design (public read = no permission name), empty migration as wiring proof, per-context provider config in every composition root

Co-Authored-By: Claude Fable 5 <noreply@anthropic.com>
Claude-Session: https://claude.ai/code/session_01XCaaD2oSfQhWv3vNENZDue
</commit_message>
<xml_diff>
--- a/docs/deliverables/out/Database.docx
+++ b/docs/deliverables/out/Database.docx
@@ -1047,6 +1047,71 @@
             </w:r>
             <w:r>
               <w:t xml:space="preserve">widened 16→32 too — the 3.8 end-to-end cap test caught the ledger still on 16</w:t>
+            </w:r>
+          </w:p>
+        </w:tc>
+      </w:tr>
+      <w:tr>
+        <w:tc>
+          <w:tcPr/>
+          <w:p>
+            <w:pPr>
+              <w:pStyle w:val="Compact"/>
+              <w:jc w:val="left"/>
+            </w:pPr>
+            <w:r>
+              <w:t xml:space="preserve">0.1.10</w:t>
+            </w:r>
+          </w:p>
+        </w:tc>
+        <w:tc>
+          <w:tcPr/>
+          <w:p>
+            <w:pPr>
+              <w:pStyle w:val="Compact"/>
+              <w:jc w:val="left"/>
+            </w:pPr>
+            <w:r>
+              <w:t xml:space="preserve">2026-09-03</w:t>
+            </w:r>
+          </w:p>
+        </w:tc>
+        <w:tc>
+          <w:tcPr/>
+          <w:p>
+            <w:pPr>
+              <w:pStyle w:val="Compact"/>
+              <w:jc w:val="left"/>
+            </w:pPr>
+            <w:r>
+              <w:t xml:space="preserve">Abdulsalam</w:t>
+            </w:r>
+          </w:p>
+        </w:tc>
+        <w:tc>
+          <w:tcPr/>
+          <w:p>
+            <w:pPr>
+              <w:pStyle w:val="Compact"/>
+              <w:jc w:val="left"/>
+            </w:pPr>
+            <w:r>
+              <w:t xml:space="preserve">Migrations log row 11:</w:t>
+            </w:r>
+            <w:r>
+              <w:t xml:space="preserve"> </w:t>
+            </w:r>
+            <w:r>
+              <w:rPr>
+                <w:rStyle w:val="VerbatimChar"/>
+              </w:rPr>
+              <w:t xml:space="preserve">guides</w:t>
+            </w:r>
+            <w:r>
+              <w:t xml:space="preserve"> </w:t>
+            </w:r>
+            <w:r>
+              <w:t xml:space="preserve">schema initial (empty) migration — Guides module skeleton (5.1)</w:t>
             </w:r>
           </w:p>
         </w:tc>
@@ -12215,6 +12280,92 @@
             </w:pPr>
             <w:r>
               <w:t xml:space="preserve">3.8</w:t>
+            </w:r>
+          </w:p>
+        </w:tc>
+      </w:tr>
+      <w:tr>
+        <w:tc>
+          <w:tcPr/>
+          <w:p>
+            <w:pPr>
+              <w:pStyle w:val="Compact"/>
+              <w:jc w:val="left"/>
+            </w:pPr>
+            <w:r>
+              <w:t xml:space="preserve">11</w:t>
+            </w:r>
+          </w:p>
+        </w:tc>
+        <w:tc>
+          <w:tcPr/>
+          <w:p>
+            <w:pPr>
+              <w:pStyle w:val="Compact"/>
+              <w:jc w:val="left"/>
+            </w:pPr>
+            <w:r>
+              <w:t xml:space="preserve">2026-09-03</w:t>
+            </w:r>
+          </w:p>
+        </w:tc>
+        <w:tc>
+          <w:tcPr/>
+          <w:p>
+            <w:pPr>
+              <w:pStyle w:val="Compact"/>
+              <w:jc w:val="left"/>
+            </w:pPr>
+            <w:r>
+              <w:t xml:space="preserve">Guides</w:t>
+            </w:r>
+          </w:p>
+        </w:tc>
+        <w:tc>
+          <w:tcPr/>
+          <w:p>
+            <w:pPr>
+              <w:pStyle w:val="Compact"/>
+              <w:jc w:val="left"/>
+            </w:pPr>
+            <w:r>
+              <w:rPr>
+                <w:rStyle w:val="VerbatimChar"/>
+              </w:rPr>
+              <w:t xml:space="preserve">20260903113549_Initial</w:t>
+            </w:r>
+            <w:r>
+              <w:t xml:space="preserve"> </w:t>
+            </w:r>
+            <w:r>
+              <w:t xml:space="preserve">— empty; creates only</w:t>
+            </w:r>
+            <w:r>
+              <w:t xml:space="preserve"> </w:t>
+            </w:r>
+            <w:r>
+              <w:rPr>
+                <w:rStyle w:val="VerbatimChar"/>
+              </w:rPr>
+              <w:t xml:space="preserve">guides.__EFMigrationsHistory</w:t>
+            </w:r>
+            <w:r>
+              <w:t xml:space="preserve"> </w:t>
+            </w:r>
+            <w:r>
+              <w:t xml:space="preserve">(tables arrive with 5.2/5.3/5.6)</w:t>
+            </w:r>
+          </w:p>
+        </w:tc>
+        <w:tc>
+          <w:tcPr/>
+          <w:p>
+            <w:pPr>
+              <w:pStyle w:val="Compact"/>
+              <w:jc w:val="left"/>
+            </w:pPr>
+            <w:r>
+              <w:t xml:space="preserve">5.1</w:t>
             </w:r>
           </w:p>
         </w:tc>

</xml_diff>